<commit_message>
style: add borders to unified input tables
</commit_message>
<xml_diff>
--- a/examples/example_1/All_in_one_input.docx
+++ b/examples/example_1/All_in_one_input.docx
@@ -31,6 +31,14 @@
         <w:tblW w:w="0" w:type="auto"/>
         <w:tblInd w:w="-1139" w:type="dxa"/>
         <w:tblLook w:val="04A0" w:firstRow="1" w:lastRow="0" w:firstColumn="1" w:lastColumn="0" w:noHBand="0" w:noVBand="1"/>
+        <w:tblBorders>
+          <w:top w:val="single" w:sz="4" w:space="0" w:color="000000"/>
+          <w:left w:val="single" w:sz="4" w:space="0" w:color="000000"/>
+          <w:bottom w:val="single" w:sz="4" w:space="0" w:color="000000"/>
+          <w:right w:val="single" w:sz="4" w:space="0" w:color="000000"/>
+          <w:insideH w:val="single" w:sz="4" w:space="0" w:color="000000"/>
+          <w:insideV w:val="single" w:sz="4" w:space="0" w:color="000000"/>
+        </w:tblBorders>
       </w:tblPr>
       <w:tblGrid>
         <w:gridCol w:w="993"/>
@@ -693,6 +701,14 @@
         <w:tblStyle w:val="a3"/>
         <w:tblW w:w="0" w:type="auto"/>
         <w:tblLook w:val="04A0" w:firstRow="1" w:lastRow="0" w:firstColumn="1" w:lastColumn="0" w:noHBand="0" w:noVBand="1"/>
+        <w:tblBorders>
+          <w:top w:val="single" w:sz="4" w:space="0" w:color="000000"/>
+          <w:left w:val="single" w:sz="4" w:space="0" w:color="000000"/>
+          <w:bottom w:val="single" w:sz="4" w:space="0" w:color="000000"/>
+          <w:right w:val="single" w:sz="4" w:space="0" w:color="000000"/>
+          <w:insideH w:val="single" w:sz="4" w:space="0" w:color="000000"/>
+          <w:insideV w:val="single" w:sz="4" w:space="0" w:color="000000"/>
+        </w:tblBorders>
       </w:tblPr>
       <w:tblGrid>
         <w:gridCol w:w="1557"/>
@@ -1114,6 +1130,14 @@
         <w:tblStyle w:val="a3"/>
         <w:tblW w:w="0" w:type="auto"/>
         <w:tblLook w:val="04A0" w:firstRow="1" w:lastRow="0" w:firstColumn="1" w:lastColumn="0" w:noHBand="0" w:noVBand="1"/>
+        <w:tblBorders>
+          <w:top w:val="single" w:sz="4" w:space="0" w:color="000000"/>
+          <w:left w:val="single" w:sz="4" w:space="0" w:color="000000"/>
+          <w:bottom w:val="single" w:sz="4" w:space="0" w:color="000000"/>
+          <w:right w:val="single" w:sz="4" w:space="0" w:color="000000"/>
+          <w:insideH w:val="single" w:sz="4" w:space="0" w:color="000000"/>
+          <w:insideV w:val="single" w:sz="4" w:space="0" w:color="000000"/>
+        </w:tblBorders>
       </w:tblPr>
       <w:tblGrid>
         <w:gridCol w:w="2436"/>

</xml_diff>